<commit_message>
feat: Briefkopf-Fußzeile neu formatiert (Arial, zentriert, 5 Zeilen)
Fußzeile (Seite 1) von mitteilung + abmahnung_verein exakt nach Vorlage
"Briefkopf 2.docx" (Sascha): zentriert, Arial; Überschrift 10 pt fett,
Leerzeile + 3 Textzeilen (Kontakt / E-Mail+Bank / Vorstände+Internet) 8 pt.
footer3.xml (First-Page-Footer, rId14) verbatim übernommen. Smoke-docx 3/3.

Co-Authored-By: Claude Opus 4.8 (1M context) <noreply@anthropic.com>
</commit_message>
<xml_diff>
--- a/vorlagen/abmahnung_verein.docx
+++ b/vorlagen/abmahnung_verein.docx
@@ -985,6 +985,9 @@
         <w:color w:val="016A2F"/>
       </w:rPr>
     </w:pPr>
+    <w:bookmarkStart w:id="0" w:name="OLE_LINK1"/>
+    <w:bookmarkStart w:id="1" w:name="OLE_LINK2"/>
+    <w:bookmarkStart w:id="2" w:name="_Hlk234907869"/>
     <w:r>
       <w:rPr>
         <w:rFonts w:ascii="Arial" w:hAnsi="Arial" w:cs="Arial"/>
@@ -1006,7 +1009,6 @@
   </w:p>
   <w:p>
     <w:pPr>
-      <w:pStyle w:val="Fuzeile"/>
       <w:jc w:val="center"/>
       <w:rPr>
         <w:rFonts w:ascii="Arial" w:hAnsi="Arial" w:cs="Arial"/>
@@ -1018,11 +1020,9 @@
   </w:p>
   <w:p>
     <w:pPr>
-      <w:pStyle w:val="Fuzeile"/>
       <w:jc w:val="center"/>
       <w:rPr>
         <w:rFonts w:ascii="Arial" w:hAnsi="Arial" w:cs="Arial"/>
-        <w:b/>
         <w:color w:val="016A2F"/>
         <w:sz w:val="16"/>
         <w:szCs w:val="16"/>
@@ -1031,17 +1031,35 @@
     <w:r>
       <w:rPr>
         <w:rFonts w:ascii="Arial" w:hAnsi="Arial" w:cs="Arial"/>
-        <w:b/>
         <w:color w:val="016A2F"/>
         <w:sz w:val="16"/>
         <w:szCs w:val="16"/>
       </w:rPr>
-      <w:t>vorstand@gartenfreunde-sillenbuch.de</w:t>
+      <w:t xml:space="preserve">Kontakt: S. Metzger c/o Gartenfreunde Sillenbuch e.V., </w:t>
+    </w:r>
+    <w:proofErr w:type="spellStart"/>
+    <w:r>
+      <w:rPr>
+        <w:rFonts w:ascii="Arial" w:hAnsi="Arial" w:cs="Arial"/>
+        <w:color w:val="016A2F"/>
+        <w:sz w:val="16"/>
+        <w:szCs w:val="16"/>
+      </w:rPr>
+      <w:t>Isegrimweg</w:t>
+    </w:r>
+    <w:proofErr w:type="spellEnd"/>
+    <w:r>
+      <w:rPr>
+        <w:rFonts w:ascii="Arial" w:hAnsi="Arial" w:cs="Arial"/>
+        <w:color w:val="016A2F"/>
+        <w:sz w:val="16"/>
+        <w:szCs w:val="16"/>
+      </w:rPr>
+      <w:t xml:space="preserve"> 30, 70619 Stuttgart, Tel: 0711/443161 </w:t>
     </w:r>
   </w:p>
   <w:p>
     <w:pPr>
-      <w:pStyle w:val="Fuzeile"/>
       <w:jc w:val="center"/>
       <w:rPr>
         <w:rFonts w:ascii="Arial" w:hAnsi="Arial" w:cs="Arial"/>
@@ -1057,17 +1075,19 @@
         <w:sz w:val="16"/>
         <w:szCs w:val="16"/>
       </w:rPr>
-      <w:t xml:space="preserve"> </w:t>
+      <w:t xml:space="preserve">E-Mail: vorstand@gartenfreunde-sillenbuch.de, Volksbank Stuttgart IBAN: DE13 6009 0100 0044 1430 01 BIC: VOBADESS </w:t>
     </w:r>
-    <w:r>
+  </w:p>
+  <w:p>
+    <w:pPr>
+      <w:jc w:val="center"/>
       <w:rPr>
         <w:rFonts w:ascii="Arial" w:hAnsi="Arial" w:cs="Arial"/>
         <w:color w:val="016A2F"/>
         <w:sz w:val="16"/>
         <w:szCs w:val="16"/>
       </w:rPr>
-      <w:t>S</w:t>
-    </w:r>
+    </w:pPr>
     <w:r>
       <w:rPr>
         <w:rFonts w:ascii="Arial" w:hAnsi="Arial" w:cs="Arial"/>
@@ -1075,295 +1095,11 @@
         <w:sz w:val="16"/>
         <w:szCs w:val="16"/>
       </w:rPr>
-      <w:t xml:space="preserve">abine </w:t>
+      <w:t>Vorstände: S. Metzger, S. Theißen, E. Strack, S. Theißen, N. Boine, Internet: www.gartenfreunde-sillenbuch.de</w:t>
     </w:r>
-    <w:r>
-      <w:rPr>
-        <w:rFonts w:ascii="Arial" w:hAnsi="Arial" w:cs="Arial"/>
-        <w:color w:val="016A2F"/>
-        <w:sz w:val="16"/>
-        <w:szCs w:val="16"/>
-      </w:rPr>
-      <w:t xml:space="preserve">Metzger c/o Gartenfreunde Sillenbuch e.V., </w:t>
-    </w:r>
-    <w:proofErr w:type="spellStart"/>
-    <w:r>
-      <w:rPr>
-        <w:rFonts w:ascii="Arial" w:hAnsi="Arial" w:cs="Arial"/>
-        <w:color w:val="016A2F"/>
-        <w:sz w:val="16"/>
-        <w:szCs w:val="16"/>
-      </w:rPr>
-      <w:t>Isegrimweg</w:t>
-    </w:r>
-    <w:proofErr w:type="spellEnd"/>
-    <w:r>
-      <w:rPr>
-        <w:rFonts w:ascii="Arial" w:hAnsi="Arial" w:cs="Arial"/>
-        <w:color w:val="016A2F"/>
-        <w:sz w:val="16"/>
-        <w:szCs w:val="16"/>
-      </w:rPr>
-      <w:t xml:space="preserve"> 30, 70619 Stuttgart, Tel: 0711/443161</w:t>
-    </w:r>
-  </w:p>
-  <w:p>
-    <w:pPr>
-      <w:pStyle w:val="Fuzeile"/>
-      <w:jc w:val="center"/>
-      <w:rPr>
-        <w:rFonts w:ascii="Arial" w:hAnsi="Arial" w:cs="Arial"/>
-        <w:color w:val="016A2F"/>
-        <w:sz w:val="16"/>
-        <w:szCs w:val="16"/>
-      </w:rPr>
-    </w:pPr>
-    <w:r>
-      <w:rPr>
-        <w:rFonts w:ascii="Arial" w:hAnsi="Arial" w:cs="Arial"/>
-        <w:color w:val="016A2F"/>
-        <w:sz w:val="16"/>
-        <w:szCs w:val="16"/>
-      </w:rPr>
-      <w:t>www.gartenfreunde-sillenbuch.de</w:t>
-    </w:r>
-  </w:p>
-  <w:p>
-    <w:pPr>
-      <w:pStyle w:val="Fuzeile"/>
-      <w:jc w:val="center"/>
-      <w:rPr>
-        <w:rFonts w:ascii="Arial" w:hAnsi="Arial" w:cs="Arial"/>
-        <w:b/>
-        <w:color w:val="016A2F"/>
-        <w:sz w:val="16"/>
-        <w:szCs w:val="16"/>
-      </w:rPr>
-    </w:pPr>
-    <w:r>
-      <w:rPr>
-        <w:rFonts w:ascii="Arial" w:hAnsi="Arial" w:cs="Arial"/>
-        <w:b/>
-        <w:color w:val="016A2F"/>
-        <w:sz w:val="16"/>
-        <w:szCs w:val="16"/>
-      </w:rPr>
-      <w:t xml:space="preserve">Volksbank Stuttgart </w:t>
-    </w:r>
-    <w:r>
-      <w:rPr>
-        <w:rFonts w:ascii="Arial" w:hAnsi="Arial" w:cs="Arial"/>
-        <w:b/>
-        <w:bCs/>
-        <w:color w:val="016A2F"/>
-        <w:sz w:val="16"/>
-        <w:szCs w:val="16"/>
-      </w:rPr>
-      <w:t>IBAN: DE13 6009 0100 0044 1430 01 BIC: VOBA</w:t>
-    </w:r>
-    <w:r>
-      <w:rPr>
-        <w:rFonts w:ascii="Arial" w:hAnsi="Arial" w:cs="Arial"/>
-        <w:b/>
-        <w:bCs/>
-        <w:color w:val="016A2F"/>
-        <w:sz w:val="16"/>
-        <w:szCs w:val="16"/>
-      </w:rPr>
-      <w:fldChar w:fldCharType="begin"/>
-    </w:r>
-    <w:r>
-      <w:rPr>
-        <w:rFonts w:ascii="Arial" w:hAnsi="Arial" w:cs="Arial"/>
-        <w:b/>
-        <w:bCs/>
-        <w:color w:val="016A2F"/>
-        <w:sz w:val="16"/>
-        <w:szCs w:val="16"/>
-      </w:rPr>
-      <w:instrText xml:space="preserve">  </w:instrText>
-    </w:r>
-    <w:r>
-      <w:rPr>
-        <w:rFonts w:ascii="Arial" w:hAnsi="Arial" w:cs="Arial"/>
-        <w:b/>
-        <w:bCs/>
-        <w:color w:val="016A2F"/>
-        <w:sz w:val="16"/>
-        <w:szCs w:val="16"/>
-      </w:rPr>
-      <w:fldChar w:fldCharType="end"/>
-    </w:r>
-    <w:r>
-      <w:rPr>
-        <w:rFonts w:ascii="Arial" w:hAnsi="Arial" w:cs="Arial"/>
-        <w:b/>
-        <w:bCs/>
-        <w:color w:val="016A2F"/>
-        <w:sz w:val="16"/>
-        <w:szCs w:val="16"/>
-      </w:rPr>
-      <w:t>DESS</w:t>
-    </w:r>
-  </w:p>
-  <w:p>
-    <w:pPr>
-      <w:pStyle w:val="Fuzeile"/>
-      <w:jc w:val="center"/>
-      <w:rPr>
-        <w:rFonts w:ascii="Arial" w:hAnsi="Arial" w:cs="Arial"/>
-        <w:color w:val="016A2F"/>
-        <w:sz w:val="16"/>
-        <w:szCs w:val="16"/>
-      </w:rPr>
-    </w:pPr>
-    <w:r>
-      <w:rPr>
-        <w:rFonts w:ascii="Arial" w:hAnsi="Arial" w:cs="Arial"/>
-        <w:color w:val="016A2F"/>
-        <w:sz w:val="16"/>
-        <w:szCs w:val="16"/>
-      </w:rPr>
-      <w:t>V</w:t>
-    </w:r>
-    <w:r>
-      <w:rPr>
-        <w:rFonts w:ascii="Arial" w:hAnsi="Arial" w:cs="Arial"/>
-        <w:color w:val="016A2F"/>
-        <w:sz w:val="16"/>
-        <w:szCs w:val="16"/>
-      </w:rPr>
-      <w:t>ereinsv</w:t>
-    </w:r>
-    <w:r>
-      <w:rPr>
-        <w:rFonts w:ascii="Arial" w:hAnsi="Arial" w:cs="Arial"/>
-        <w:color w:val="016A2F"/>
-        <w:sz w:val="16"/>
-        <w:szCs w:val="16"/>
-      </w:rPr>
-      <w:t>orst</w:t>
-    </w:r>
-    <w:r>
-      <w:rPr>
-        <w:rFonts w:ascii="Arial" w:hAnsi="Arial" w:cs="Arial"/>
-        <w:color w:val="016A2F"/>
-        <w:sz w:val="16"/>
-        <w:szCs w:val="16"/>
-      </w:rPr>
-      <w:t>and</w:t>
-    </w:r>
-    <w:r>
-      <w:rPr>
-        <w:rFonts w:ascii="Arial" w:hAnsi="Arial" w:cs="Arial"/>
-        <w:color w:val="016A2F"/>
-        <w:sz w:val="16"/>
-        <w:szCs w:val="16"/>
-      </w:rPr>
-      <w:t>: S</w:t>
-    </w:r>
-    <w:r>
-      <w:rPr>
-        <w:rFonts w:ascii="Arial" w:hAnsi="Arial" w:cs="Arial"/>
-        <w:color w:val="016A2F"/>
-        <w:sz w:val="16"/>
-        <w:szCs w:val="16"/>
-      </w:rPr>
-      <w:t>abine</w:t>
-    </w:r>
-    <w:r>
-      <w:rPr>
-        <w:rFonts w:ascii="Arial" w:hAnsi="Arial" w:cs="Arial"/>
-        <w:color w:val="016A2F"/>
-        <w:sz w:val="16"/>
-        <w:szCs w:val="16"/>
-      </w:rPr>
-      <w:t xml:space="preserve"> Metzger, </w:t>
-    </w:r>
-    <w:r>
-      <w:rPr>
-        <w:rFonts w:ascii="Arial" w:hAnsi="Arial" w:cs="Arial"/>
-        <w:color w:val="016A2F"/>
-        <w:sz w:val="16"/>
-        <w:szCs w:val="16"/>
-      </w:rPr>
-      <w:t>Sascha Theißen</w:t>
-    </w:r>
-    <w:r>
-      <w:rPr>
-        <w:rFonts w:ascii="Arial" w:hAnsi="Arial" w:cs="Arial"/>
-        <w:color w:val="016A2F"/>
-        <w:sz w:val="16"/>
-        <w:szCs w:val="16"/>
-      </w:rPr>
-      <w:t xml:space="preserve">, </w:t>
-    </w:r>
-    <w:r>
-      <w:rPr>
-        <w:rFonts w:ascii="Arial" w:hAnsi="Arial" w:cs="Arial"/>
-        <w:color w:val="016A2F"/>
-        <w:sz w:val="16"/>
-        <w:szCs w:val="16"/>
-      </w:rPr>
-      <w:t>Erika Strack</w:t>
-    </w:r>
-    <w:r>
-      <w:rPr>
-        <w:rFonts w:ascii="Arial" w:hAnsi="Arial" w:cs="Arial"/>
-        <w:color w:val="016A2F"/>
-        <w:sz w:val="16"/>
-        <w:szCs w:val="16"/>
-      </w:rPr>
-      <w:t>, S</w:t>
-    </w:r>
-    <w:r>
-      <w:rPr>
-        <w:rFonts w:ascii="Arial" w:hAnsi="Arial" w:cs="Arial"/>
-        <w:color w:val="016A2F"/>
-        <w:sz w:val="16"/>
-        <w:szCs w:val="16"/>
-      </w:rPr>
-      <w:t>onja</w:t>
-    </w:r>
-    <w:r>
-      <w:rPr>
-        <w:rFonts w:ascii="Arial" w:hAnsi="Arial" w:cs="Arial"/>
-        <w:color w:val="016A2F"/>
-        <w:sz w:val="16"/>
-        <w:szCs w:val="16"/>
-      </w:rPr>
-      <w:t xml:space="preserve"> Theißen, N</w:t>
-    </w:r>
-    <w:r>
-      <w:rPr>
-        <w:rFonts w:ascii="Arial" w:hAnsi="Arial" w:cs="Arial"/>
-        <w:color w:val="016A2F"/>
-        <w:sz w:val="16"/>
-        <w:szCs w:val="16"/>
-      </w:rPr>
-      <w:t>icole</w:t>
-    </w:r>
-    <w:r>
-      <w:rPr>
-        <w:rFonts w:ascii="Arial" w:hAnsi="Arial" w:cs="Arial"/>
-        <w:color w:val="016A2F"/>
-        <w:sz w:val="16"/>
-        <w:szCs w:val="16"/>
-      </w:rPr>
-      <w:t xml:space="preserve"> Boine </w:t>
-    </w:r>
-  </w:p>
-  <w:p>
-    <w:pPr>
-      <w:pStyle w:val="Fuzeile"/>
-      <w:jc w:val="center"/>
-      <w:rPr>
-        <w:rFonts w:ascii="Arial" w:hAnsi="Arial" w:cs="Arial"/>
-        <w:color w:val="016A2F"/>
-        <w:sz w:val="16"/>
-        <w:szCs w:val="16"/>
-      </w:rPr>
-    </w:pPr>
+    <w:bookmarkEnd w:id="0"/>
+    <w:bookmarkEnd w:id="1"/>
+    <w:bookmarkEnd w:id="2"/>
   </w:p>
 </w:ftr>
 </file>

</xml_diff>